<commit_message>
updated dates to include 2024 lifeline connect
</commit_message>
<xml_diff>
--- a/public/resume.docx
+++ b/public/resume.docx
@@ -26,52 +26,21 @@
           <w:sz w:val="21"/>
           <w:szCs w:val="21"/>
         </w:rPr>
-        <w:t xml:space="preserve">Full Stack </w:t>
-      </w:r>
-      <w:proofErr w:type="gramStart"/>
-      <w:r>
-        <w:rPr>
-          <w:rFonts w:ascii="Arial" w:eastAsia="Arial" w:hAnsi="Arial" w:cs="Arial"/>
-          <w:color w:val="6B7280"/>
-          <w:sz w:val="21"/>
-          <w:szCs w:val="21"/>
-        </w:rPr>
-        <w:t>Developer  |</w:t>
-      </w:r>
-      <w:proofErr w:type="gramEnd"/>
-      <w:r>
-        <w:rPr>
-          <w:rFonts w:ascii="Arial" w:eastAsia="Arial" w:hAnsi="Arial" w:cs="Arial"/>
-          <w:color w:val="6B7280"/>
-          <w:sz w:val="21"/>
-          <w:szCs w:val="21"/>
-        </w:rPr>
-        <w:t xml:space="preserve">  Backend Developer</w:t>
+        <w:t>Full Stack Developer  |  Backend Developer</w:t>
       </w:r>
     </w:p>
     <w:p>
       <w:pPr>
         <w:spacing w:after="80"/>
       </w:pPr>
-      <w:proofErr w:type="gramStart"/>
-      <w:r>
-        <w:rPr>
-          <w:rFonts w:ascii="Arial" w:eastAsia="Arial" w:hAnsi="Arial" w:cs="Arial"/>
-          <w:color w:val="111827"/>
-          <w:sz w:val="17"/>
-          <w:szCs w:val="17"/>
-        </w:rPr>
-        <w:t>09924782938  |</w:t>
-      </w:r>
-      <w:proofErr w:type="gramEnd"/>
-      <w:r>
-        <w:rPr>
-          <w:rFonts w:ascii="Arial" w:eastAsia="Arial" w:hAnsi="Arial" w:cs="Arial"/>
-          <w:color w:val="111827"/>
-          <w:sz w:val="17"/>
-          <w:szCs w:val="17"/>
-        </w:rPr>
-        <w:t xml:space="preserve">  davenalajid@gmail.com  |  </w:t>
+      <w:r>
+        <w:rPr>
+          <w:rFonts w:ascii="Arial" w:eastAsia="Arial" w:hAnsi="Arial" w:cs="Arial"/>
+          <w:color w:val="111827"/>
+          <w:sz w:val="17"/>
+          <w:szCs w:val="17"/>
+        </w:rPr>
+        <w:t xml:space="preserve">09924782938  |  davenalajid@gmail.com  |  </w:t>
       </w:r>
       <w:proofErr w:type="spellStart"/>
       <w:r>
@@ -276,38 +245,16 @@
           <w:sz w:val="19"/>
           <w:szCs w:val="19"/>
         </w:rPr>
-        <w:t xml:space="preserve"> Developer </w:t>
-      </w:r>
-      <w:proofErr w:type="gramStart"/>
-      <w:r>
-        <w:rPr>
-          <w:rFonts w:ascii="Arial" w:eastAsia="Arial" w:hAnsi="Arial" w:cs="Arial"/>
-          <w:b/>
-          <w:bCs/>
-          <w:color w:val="111827"/>
-          <w:sz w:val="19"/>
-          <w:szCs w:val="19"/>
-        </w:rPr>
-        <w:t>Intern</w:t>
-      </w:r>
-      <w:r>
-        <w:rPr>
-          <w:rFonts w:ascii="Arial" w:eastAsia="Arial" w:hAnsi="Arial" w:cs="Arial"/>
-          <w:color w:val="6B7280"/>
-          <w:sz w:val="18"/>
-          <w:szCs w:val="18"/>
-        </w:rPr>
-        <w:t xml:space="preserve">  ·</w:t>
-      </w:r>
-      <w:proofErr w:type="gramEnd"/>
-      <w:r>
-        <w:rPr>
-          <w:rFonts w:ascii="Arial" w:eastAsia="Arial" w:hAnsi="Arial" w:cs="Arial"/>
-          <w:color w:val="6B7280"/>
-          <w:sz w:val="18"/>
-          <w:szCs w:val="18"/>
-        </w:rPr>
-        <w:t xml:space="preserve">  </w:t>
+        <w:t xml:space="preserve"> Developer Intern</w:t>
+      </w:r>
+      <w:r>
+        <w:rPr>
+          <w:rFonts w:ascii="Arial" w:eastAsia="Arial" w:hAnsi="Arial" w:cs="Arial"/>
+          <w:color w:val="6B7280"/>
+          <w:sz w:val="18"/>
+          <w:szCs w:val="18"/>
+        </w:rPr>
+        <w:t xml:space="preserve">  ·  </w:t>
       </w:r>
       <w:r>
         <w:rPr>
@@ -476,38 +423,16 @@
           <w:sz w:val="19"/>
           <w:szCs w:val="19"/>
         </w:rPr>
-        <w:t xml:space="preserve">Freelance Full Stack </w:t>
-      </w:r>
-      <w:proofErr w:type="gramStart"/>
-      <w:r>
-        <w:rPr>
-          <w:rFonts w:ascii="Arial" w:eastAsia="Arial" w:hAnsi="Arial" w:cs="Arial"/>
-          <w:b/>
-          <w:bCs/>
-          <w:color w:val="111827"/>
-          <w:sz w:val="19"/>
-          <w:szCs w:val="19"/>
-        </w:rPr>
-        <w:t>Developer</w:t>
-      </w:r>
-      <w:r>
-        <w:rPr>
-          <w:rFonts w:ascii="Arial" w:eastAsia="Arial" w:hAnsi="Arial" w:cs="Arial"/>
-          <w:color w:val="6B7280"/>
-          <w:sz w:val="18"/>
-          <w:szCs w:val="18"/>
-        </w:rPr>
-        <w:t xml:space="preserve">  ·</w:t>
-      </w:r>
-      <w:proofErr w:type="gramEnd"/>
-      <w:r>
-        <w:rPr>
-          <w:rFonts w:ascii="Arial" w:eastAsia="Arial" w:hAnsi="Arial" w:cs="Arial"/>
-          <w:color w:val="6B7280"/>
-          <w:sz w:val="18"/>
-          <w:szCs w:val="18"/>
-        </w:rPr>
-        <w:t xml:space="preserve">  </w:t>
+        <w:t>Freelance Full Stack Developer</w:t>
+      </w:r>
+      <w:r>
+        <w:rPr>
+          <w:rFonts w:ascii="Arial" w:eastAsia="Arial" w:hAnsi="Arial" w:cs="Arial"/>
+          <w:color w:val="6B7280"/>
+          <w:sz w:val="18"/>
+          <w:szCs w:val="18"/>
+        </w:rPr>
+        <w:t xml:space="preserve">  ·  </w:t>
       </w:r>
       <w:r>
         <w:rPr>
@@ -689,7 +614,39 @@
           <w:szCs w:val="17"/>
         </w:rPr>
         <w:tab/>
-        <w:t>Apr 2026</w:t>
+      </w:r>
+      <w:r>
+        <w:rPr>
+          <w:rFonts w:ascii="Arial" w:eastAsia="Arial" w:hAnsi="Arial" w:cs="Arial"/>
+          <w:i/>
+          <w:iCs/>
+          <w:color w:val="6B7280"/>
+          <w:sz w:val="17"/>
+          <w:szCs w:val="17"/>
+        </w:rPr>
+        <w:t>Feb</w:t>
+      </w:r>
+      <w:r>
+        <w:rPr>
+          <w:rFonts w:ascii="Arial" w:eastAsia="Arial" w:hAnsi="Arial" w:cs="Arial"/>
+          <w:i/>
+          <w:iCs/>
+          <w:color w:val="6B7280"/>
+          <w:sz w:val="17"/>
+          <w:szCs w:val="17"/>
+        </w:rPr>
+        <w:t xml:space="preserve"> 2026</w:t>
+      </w:r>
+      <w:r>
+        <w:rPr>
+          <w:rFonts w:ascii="Arial" w:eastAsia="Arial" w:hAnsi="Arial" w:cs="Arial"/>
+          <w:i/>
+          <w:iCs/>
+          <w:color w:val="6B7280"/>
+          <w:sz w:val="17"/>
+          <w:szCs w:val="17"/>
+        </w:rPr>
+        <w:t xml:space="preserve"> – May 2026</w:t>
       </w:r>
     </w:p>
     <w:p>
@@ -706,7 +663,6 @@
       </w:pPr>
       <w:hyperlink r:id="rId7" w:history="1">
         <w:proofErr w:type="spellStart"/>
-        <w:proofErr w:type="gramStart"/>
         <w:r>
           <w:rPr>
             <w:rStyle w:val="Hyperlink"/>
@@ -719,7 +675,6 @@
           <w:t>prdpmin.online</w:t>
         </w:r>
         <w:proofErr w:type="spellEnd"/>
-        <w:proofErr w:type="gramEnd"/>
       </w:hyperlink>
     </w:p>
     <w:p>
@@ -1118,7 +1073,39 @@
           <w:szCs w:val="17"/>
         </w:rPr>
         <w:tab/>
-        <w:t>Jun 2025</w:t>
+      </w:r>
+      <w:r>
+        <w:rPr>
+          <w:rFonts w:ascii="Arial" w:eastAsia="Arial" w:hAnsi="Arial" w:cs="Arial"/>
+          <w:i/>
+          <w:iCs/>
+          <w:color w:val="6B7280"/>
+          <w:sz w:val="17"/>
+          <w:szCs w:val="17"/>
+        </w:rPr>
+        <w:t>Aug</w:t>
+      </w:r>
+      <w:r>
+        <w:rPr>
+          <w:rFonts w:ascii="Arial" w:eastAsia="Arial" w:hAnsi="Arial" w:cs="Arial"/>
+          <w:i/>
+          <w:iCs/>
+          <w:color w:val="6B7280"/>
+          <w:sz w:val="17"/>
+          <w:szCs w:val="17"/>
+        </w:rPr>
+        <w:t xml:space="preserve"> 202</w:t>
+      </w:r>
+      <w:r>
+        <w:rPr>
+          <w:rFonts w:ascii="Arial" w:eastAsia="Arial" w:hAnsi="Arial" w:cs="Arial"/>
+          <w:i/>
+          <w:iCs/>
+          <w:color w:val="6B7280"/>
+          <w:sz w:val="17"/>
+          <w:szCs w:val="17"/>
+        </w:rPr>
+        <w:t>4 - Present</w:t>
       </w:r>
     </w:p>
     <w:p>
@@ -1136,7 +1123,6 @@
       </w:pPr>
       <w:hyperlink r:id="rId9" w:history="1">
         <w:proofErr w:type="spellStart"/>
-        <w:proofErr w:type="gramStart"/>
         <w:r>
           <w:rPr>
             <w:rStyle w:val="Hyperlink"/>
@@ -1149,7 +1135,6 @@
           <w:t>lifelineconnect.online</w:t>
         </w:r>
         <w:proofErr w:type="spellEnd"/>
-        <w:proofErr w:type="gramEnd"/>
       </w:hyperlink>
     </w:p>
     <w:p>
@@ -1372,7 +1357,28 @@
           <w:szCs w:val="17"/>
         </w:rPr>
         <w:tab/>
-        <w:t>Jul 2026</w:t>
+      </w:r>
+      <w:r>
+        <w:rPr>
+          <w:rFonts w:ascii="Arial" w:eastAsia="Arial" w:hAnsi="Arial" w:cs="Arial"/>
+          <w:i/>
+          <w:iCs/>
+          <w:color w:val="6B7280"/>
+          <w:sz w:val="17"/>
+          <w:szCs w:val="17"/>
+        </w:rPr>
+        <w:t>Aug 2022 - May</w:t>
+      </w:r>
+      <w:r>
+        <w:rPr>
+          <w:rFonts w:ascii="Arial" w:eastAsia="Arial" w:hAnsi="Arial" w:cs="Arial"/>
+          <w:i/>
+          <w:iCs/>
+          <w:color w:val="6B7280"/>
+          <w:sz w:val="17"/>
+          <w:szCs w:val="17"/>
+        </w:rPr>
+        <w:t xml:space="preserve"> 2026</w:t>
       </w:r>
     </w:p>
     <w:p>

</xml_diff>

<commit_message>
updated grammar and adjusted tech skills
</commit_message>
<xml_diff>
--- a/public/resume.docx
+++ b/public/resume.docx
@@ -40,30 +40,9 @@
           <w:sz w:val="17"/>
           <w:szCs w:val="17"/>
         </w:rPr>
-        <w:t xml:space="preserve">09924782938  |  davenalajid@gmail.com  |  </w:t>
-      </w:r>
-      <w:proofErr w:type="spellStart"/>
-      <w:r>
-        <w:rPr>
-          <w:rFonts w:ascii="Arial" w:eastAsia="Arial" w:hAnsi="Arial" w:cs="Arial"/>
-          <w:color w:val="111827"/>
-          <w:sz w:val="17"/>
-          <w:szCs w:val="17"/>
-        </w:rPr>
-        <w:t>Maramag</w:t>
-      </w:r>
-      <w:proofErr w:type="spellEnd"/>
-      <w:r>
-        <w:rPr>
-          <w:rFonts w:ascii="Arial" w:eastAsia="Arial" w:hAnsi="Arial" w:cs="Arial"/>
-          <w:color w:val="111827"/>
-          <w:sz w:val="17"/>
-          <w:szCs w:val="17"/>
-        </w:rPr>
-        <w:t xml:space="preserve">, Bukidnon, PH  |  </w:t>
+        <w:t xml:space="preserve">09924782938  |  davenalajid@gmail.com  |  Maramag, Bukidnon, PH  |  </w:t>
       </w:r>
       <w:hyperlink r:id="rId5" w:history="1">
-        <w:proofErr w:type="spellStart"/>
         <w:r>
           <w:rPr>
             <w:rFonts w:ascii="Arial" w:eastAsia="Arial" w:hAnsi="Arial" w:cs="Arial"/>
@@ -74,7 +53,6 @@
           </w:rPr>
           <w:t>garlicbread.space</w:t>
         </w:r>
-        <w:proofErr w:type="spellEnd"/>
       </w:hyperlink>
       <w:r>
         <w:rPr>
@@ -133,70 +111,7 @@
           <w:sz w:val="18"/>
           <w:szCs w:val="18"/>
         </w:rPr>
-        <w:t>Full Stack Developer with hands-on experience delivering production web applications for real clients across government, enterprise, and startup sectors. Proficient in Laravel, React, TypeScript, and cloud infrastructure (Docker, Railway</w:t>
-      </w:r>
-      <w:r>
-        <w:rPr>
-          <w:rFonts w:ascii="Arial" w:eastAsia="Arial" w:hAnsi="Arial" w:cs="Arial"/>
-          <w:color w:val="111827"/>
-          <w:sz w:val="18"/>
-          <w:szCs w:val="18"/>
-        </w:rPr>
-        <w:t>, AWS</w:t>
-      </w:r>
-      <w:r>
-        <w:rPr>
-          <w:rFonts w:ascii="Arial" w:eastAsia="Arial" w:hAnsi="Arial" w:cs="Arial"/>
-          <w:color w:val="111827"/>
-          <w:sz w:val="18"/>
-          <w:szCs w:val="18"/>
-        </w:rPr>
-        <w:t xml:space="preserve">). </w:t>
-      </w:r>
-      <w:r>
-        <w:rPr>
-          <w:rFonts w:ascii="Arial" w:eastAsia="Arial" w:hAnsi="Arial" w:cs="Arial"/>
-          <w:color w:val="111827"/>
-          <w:sz w:val="18"/>
-          <w:szCs w:val="18"/>
-        </w:rPr>
-        <w:t xml:space="preserve">Skilled at automating complex business processes, integrating third-party </w:t>
-      </w:r>
-      <w:r>
-        <w:rPr>
-          <w:rFonts w:ascii="Arial" w:eastAsia="Arial" w:hAnsi="Arial" w:cs="Arial"/>
-          <w:color w:val="111827"/>
-          <w:sz w:val="18"/>
-          <w:szCs w:val="18"/>
-        </w:rPr>
-        <w:t>APIs</w:t>
-      </w:r>
-      <w:r>
-        <w:rPr>
-          <w:rFonts w:ascii="Arial" w:eastAsia="Arial" w:hAnsi="Arial" w:cs="Arial"/>
-          <w:color w:val="111827"/>
-          <w:sz w:val="18"/>
-          <w:szCs w:val="18"/>
-        </w:rPr>
-        <w:t>, and delivering end-to-end solutions independently</w:t>
-      </w:r>
-      <w:r>
-        <w:rPr>
-          <w:rFonts w:ascii="Arial" w:eastAsia="Arial" w:hAnsi="Arial" w:cs="Arial"/>
-          <w:color w:val="111827"/>
-          <w:sz w:val="18"/>
-          <w:szCs w:val="18"/>
-        </w:rPr>
-        <w:t xml:space="preserve"> within compliance-driven environments</w:t>
-      </w:r>
-      <w:r>
-        <w:rPr>
-          <w:rFonts w:ascii="Arial" w:eastAsia="Arial" w:hAnsi="Arial" w:cs="Arial"/>
-          <w:color w:val="111827"/>
-          <w:sz w:val="18"/>
-          <w:szCs w:val="18"/>
-        </w:rPr>
-        <w:t>.</w:t>
+        <w:t>Full Stack Developer with hands-on experience delivering production web applications for clients in government, enterprise, and startup sectors. Proficient in Laravel, React, TypeScript, and cloud infrastructure (Docker, Railway, AWS). Automates complex business processes and integrates third-party APIs, and has delivered complete applications independently, end to end, in compliance-driven environments.</w:t>
       </w:r>
     </w:p>
     <w:p>
@@ -254,7 +169,25 @@
           <w:sz w:val="18"/>
           <w:szCs w:val="18"/>
         </w:rPr>
-        <w:t xml:space="preserve">  ·  </w:t>
+        <w:t xml:space="preserve"> </w:t>
+      </w:r>
+      <w:r>
+        <w:rPr>
+          <w:rFonts w:ascii="Arial" w:eastAsia="Arial" w:hAnsi="Arial" w:cs="Arial"/>
+          <w:color w:val="6B7280"/>
+          <w:sz w:val="18"/>
+          <w:szCs w:val="18"/>
+        </w:rPr>
+        <w:t xml:space="preserve"> </w:t>
+      </w:r>
+      <w:r>
+        <w:rPr>
+          <w:rFonts w:ascii="Arial" w:eastAsia="Arial" w:hAnsi="Arial" w:cs="Arial"/>
+          <w:color w:val="6B7280"/>
+          <w:sz w:val="18"/>
+          <w:szCs w:val="18"/>
+        </w:rPr>
+        <w:t xml:space="preserve">·  </w:t>
       </w:r>
       <w:r>
         <w:rPr>
@@ -291,31 +224,7 @@
           <w:sz w:val="17"/>
           <w:szCs w:val="17"/>
         </w:rPr>
-        <w:t xml:space="preserve">Laravel · React · TypeScript · </w:t>
-      </w:r>
-      <w:proofErr w:type="spellStart"/>
-      <w:r>
-        <w:rPr>
-          <w:rFonts w:ascii="Arial" w:eastAsia="Arial" w:hAnsi="Arial" w:cs="Arial"/>
-          <w:i/>
-          <w:iCs/>
-          <w:color w:val="6B7280"/>
-          <w:sz w:val="17"/>
-          <w:szCs w:val="17"/>
-        </w:rPr>
-        <w:t>Shadcn</w:t>
-      </w:r>
-      <w:proofErr w:type="spellEnd"/>
-      <w:r>
-        <w:rPr>
-          <w:rFonts w:ascii="Arial" w:eastAsia="Arial" w:hAnsi="Arial" w:cs="Arial"/>
-          <w:i/>
-          <w:iCs/>
-          <w:color w:val="6B7280"/>
-          <w:sz w:val="17"/>
-          <w:szCs w:val="17"/>
-        </w:rPr>
-        <w:t xml:space="preserve"> UI · Railway</w:t>
+        <w:t>Laravel · React · TypeScript · Shadcn UI · Railway</w:t>
       </w:r>
     </w:p>
     <w:p>
@@ -334,16 +243,165 @@
           <w:sz w:val="18"/>
           <w:szCs w:val="18"/>
         </w:rPr>
-        <w:t>Collaborated with a development team using Git and GitHub to build and deliver HRIS, document tracking, and inventory management systems for government and public-sector clients operating in compliance-driven environments</w:t>
-      </w:r>
-      <w:r>
-        <w:rPr>
-          <w:rFonts w:ascii="Arial" w:eastAsia="Arial" w:hAnsi="Arial" w:cs="Arial"/>
-          <w:color w:val="111827"/>
-          <w:sz w:val="18"/>
-          <w:szCs w:val="18"/>
-        </w:rPr>
-        <w:t>.</w:t>
+        <w:t>Collaborated with a development team using Git and GitHub to build and deliver HRIS, document tracking, and inventory management systems for government and public-sector clients in compliance-driven environments.</w:t>
+      </w:r>
+    </w:p>
+    <w:p>
+      <w:pPr>
+        <w:pStyle w:val="ListParagraph"/>
+        <w:numPr>
+          <w:ilvl w:val="0"/>
+          <w:numId w:val="2"/>
+        </w:numPr>
+        <w:rPr>
+          <w:rFonts w:ascii="Arial" w:eastAsia="Arial" w:hAnsi="Arial" w:cs="Arial"/>
+          <w:color w:val="111827"/>
+          <w:sz w:val="18"/>
+          <w:szCs w:val="18"/>
+        </w:rPr>
+      </w:pPr>
+      <w:r>
+        <w:rPr>
+          <w:rFonts w:ascii="Arial" w:eastAsia="Arial" w:hAnsi="Arial" w:cs="Arial"/>
+          <w:color w:val="111827"/>
+          <w:sz w:val="18"/>
+          <w:szCs w:val="18"/>
+        </w:rPr>
+        <w:t xml:space="preserve">Contributed to </w:t>
+      </w:r>
+      <w:r>
+        <w:rPr>
+          <w:rFonts w:ascii="Arial" w:eastAsia="Arial" w:hAnsi="Arial" w:cs="Arial"/>
+          <w:color w:val="111827"/>
+          <w:sz w:val="18"/>
+          <w:szCs w:val="18"/>
+        </w:rPr>
+        <w:t>build</w:t>
+      </w:r>
+      <w:r>
+        <w:rPr>
+          <w:rFonts w:ascii="Arial" w:eastAsia="Arial" w:hAnsi="Arial" w:cs="Arial"/>
+          <w:color w:val="111827"/>
+          <w:sz w:val="18"/>
+          <w:szCs w:val="18"/>
+        </w:rPr>
+        <w:t>ing</w:t>
+      </w:r>
+      <w:r>
+        <w:rPr>
+          <w:rFonts w:ascii="Arial" w:eastAsia="Arial" w:hAnsi="Arial" w:cs="Arial"/>
+          <w:color w:val="111827"/>
+          <w:sz w:val="18"/>
+          <w:szCs w:val="18"/>
+        </w:rPr>
+        <w:t xml:space="preserve"> and launch</w:t>
+      </w:r>
+      <w:r>
+        <w:rPr>
+          <w:rFonts w:ascii="Arial" w:eastAsia="Arial" w:hAnsi="Arial" w:cs="Arial"/>
+          <w:color w:val="111827"/>
+          <w:sz w:val="18"/>
+          <w:szCs w:val="18"/>
+        </w:rPr>
+        <w:t>ing</w:t>
+      </w:r>
+      <w:r>
+        <w:rPr>
+          <w:rFonts w:ascii="Arial" w:eastAsia="Arial" w:hAnsi="Arial" w:cs="Arial"/>
+          <w:color w:val="111827"/>
+          <w:sz w:val="18"/>
+          <w:szCs w:val="18"/>
+        </w:rPr>
+        <w:t xml:space="preserve"> a microsite for the Philippine Rural Development Project (PRDP), and deployed it to Railway for a 3-day public event.</w:t>
+      </w:r>
+    </w:p>
+    <w:p>
+      <w:pPr>
+        <w:pStyle w:val="ListParagraph"/>
+        <w:numPr>
+          <w:ilvl w:val="0"/>
+          <w:numId w:val="2"/>
+        </w:numPr>
+        <w:rPr>
+          <w:rFonts w:ascii="Arial" w:eastAsia="Arial" w:hAnsi="Arial" w:cs="Arial"/>
+          <w:color w:val="111827"/>
+          <w:sz w:val="18"/>
+          <w:szCs w:val="18"/>
+        </w:rPr>
+      </w:pPr>
+      <w:r>
+        <w:rPr>
+          <w:rFonts w:ascii="Arial" w:eastAsia="Arial" w:hAnsi="Arial" w:cs="Arial"/>
+          <w:color w:val="111827"/>
+          <w:sz w:val="18"/>
+          <w:szCs w:val="18"/>
+        </w:rPr>
+        <w:t>Served as support technical lead for deployment, requirements analysis, and system maintenance across HRIS and document tracking modules.</w:t>
+      </w:r>
+    </w:p>
+    <w:p>
+      <w:pPr>
+        <w:tabs>
+          <w:tab w:val="right" w:pos="10206"/>
+        </w:tabs>
+        <w:spacing w:before="100" w:after="16"/>
+      </w:pPr>
+      <w:r>
+        <w:rPr>
+          <w:rFonts w:ascii="Arial" w:eastAsia="Arial" w:hAnsi="Arial" w:cs="Arial"/>
+          <w:b/>
+          <w:bCs/>
+          <w:color w:val="111827"/>
+          <w:sz w:val="19"/>
+          <w:szCs w:val="19"/>
+        </w:rPr>
+        <w:t>Freelance Full Stack Developer</w:t>
+      </w:r>
+      <w:r>
+        <w:rPr>
+          <w:rFonts w:ascii="Arial" w:eastAsia="Arial" w:hAnsi="Arial" w:cs="Arial"/>
+          <w:color w:val="6B7280"/>
+          <w:sz w:val="18"/>
+          <w:szCs w:val="18"/>
+        </w:rPr>
+        <w:t xml:space="preserve">  ·  </w:t>
+      </w:r>
+      <w:r>
+        <w:rPr>
+          <w:rFonts w:ascii="Arial" w:eastAsia="Arial" w:hAnsi="Arial" w:cs="Arial"/>
+          <w:color w:val="1A56DB"/>
+          <w:sz w:val="18"/>
+          <w:szCs w:val="18"/>
+        </w:rPr>
+        <w:t>Self-Employed</w:t>
+      </w:r>
+      <w:r>
+        <w:rPr>
+          <w:rFonts w:ascii="Arial" w:eastAsia="Arial" w:hAnsi="Arial" w:cs="Arial"/>
+          <w:i/>
+          <w:iCs/>
+          <w:color w:val="6B7280"/>
+          <w:sz w:val="17"/>
+          <w:szCs w:val="17"/>
+        </w:rPr>
+        <w:tab/>
+        <w:t>Dec 2025 – Present</w:t>
+      </w:r>
+    </w:p>
+    <w:p>
+      <w:pPr>
+        <w:spacing w:after="20"/>
+      </w:pPr>
+      <w:r>
+        <w:rPr>
+          <w:rFonts w:ascii="Arial" w:eastAsia="Arial" w:hAnsi="Arial" w:cs="Arial"/>
+          <w:i/>
+          <w:iCs/>
+          <w:color w:val="6B7280"/>
+          <w:sz w:val="17"/>
+          <w:szCs w:val="17"/>
+        </w:rPr>
+        <w:t>Laravel · React · TypeScript · Shadcn UI · Docker · Railway</w:t>
       </w:r>
     </w:p>
     <w:p>
@@ -362,138 +420,7 @@
           <w:sz w:val="18"/>
           <w:szCs w:val="18"/>
         </w:rPr>
-        <w:t>Architected and deployed a railway bucket for scalable, secure government document management.</w:t>
-      </w:r>
-    </w:p>
-    <w:p>
-      <w:pPr>
-        <w:pStyle w:val="ListParagraph"/>
-        <w:numPr>
-          <w:ilvl w:val="0"/>
-          <w:numId w:val="2"/>
-        </w:numPr>
-        <w:rPr>
-          <w:rFonts w:ascii="Arial" w:eastAsia="Arial" w:hAnsi="Arial" w:cs="Arial"/>
-          <w:color w:val="111827"/>
-          <w:sz w:val="18"/>
-          <w:szCs w:val="18"/>
-        </w:rPr>
-      </w:pPr>
-      <w:r>
-        <w:rPr>
-          <w:rFonts w:ascii="Arial" w:eastAsia="Arial" w:hAnsi="Arial" w:cs="Arial"/>
-          <w:color w:val="111827"/>
-          <w:sz w:val="18"/>
-          <w:szCs w:val="18"/>
-        </w:rPr>
-        <w:t xml:space="preserve">Contributed to the development and launch of a public-facing microsite for </w:t>
-      </w:r>
-      <w:r>
-        <w:rPr>
-          <w:rFonts w:ascii="Arial" w:eastAsia="Arial" w:hAnsi="Arial" w:cs="Arial"/>
-          <w:color w:val="111827"/>
-          <w:sz w:val="18"/>
-          <w:szCs w:val="18"/>
-        </w:rPr>
-        <w:t>the Philippine Rural Development Project (PRDP)</w:t>
-      </w:r>
-      <w:r>
-        <w:rPr>
-          <w:rFonts w:ascii="Arial" w:eastAsia="Arial" w:hAnsi="Arial" w:cs="Arial"/>
-          <w:color w:val="111827"/>
-          <w:sz w:val="18"/>
-          <w:szCs w:val="18"/>
-        </w:rPr>
-        <w:t>, handling deployment to Railway for a 3-day public event.</w:t>
-      </w:r>
-    </w:p>
-    <w:p>
-      <w:pPr>
-        <w:tabs>
-          <w:tab w:val="right" w:pos="10206"/>
-        </w:tabs>
-        <w:spacing w:before="100" w:after="16"/>
-      </w:pPr>
-      <w:r>
-        <w:rPr>
-          <w:rFonts w:ascii="Arial" w:eastAsia="Arial" w:hAnsi="Arial" w:cs="Arial"/>
-          <w:b/>
-          <w:bCs/>
-          <w:color w:val="111827"/>
-          <w:sz w:val="19"/>
-          <w:szCs w:val="19"/>
-        </w:rPr>
-        <w:t>Freelance Full Stack Developer</w:t>
-      </w:r>
-      <w:r>
-        <w:rPr>
-          <w:rFonts w:ascii="Arial" w:eastAsia="Arial" w:hAnsi="Arial" w:cs="Arial"/>
-          <w:color w:val="6B7280"/>
-          <w:sz w:val="18"/>
-          <w:szCs w:val="18"/>
-        </w:rPr>
-        <w:t xml:space="preserve">  ·  </w:t>
-      </w:r>
-      <w:r>
-        <w:rPr>
-          <w:rFonts w:ascii="Arial" w:eastAsia="Arial" w:hAnsi="Arial" w:cs="Arial"/>
-          <w:color w:val="1A56DB"/>
-          <w:sz w:val="18"/>
-          <w:szCs w:val="18"/>
-        </w:rPr>
-        <w:t>Self-Employed</w:t>
-      </w:r>
-      <w:r>
-        <w:rPr>
-          <w:rFonts w:ascii="Arial" w:eastAsia="Arial" w:hAnsi="Arial" w:cs="Arial"/>
-          <w:i/>
-          <w:iCs/>
-          <w:color w:val="6B7280"/>
-          <w:sz w:val="17"/>
-          <w:szCs w:val="17"/>
-        </w:rPr>
-        <w:tab/>
-        <w:t>Dec 2025 – Present</w:t>
-      </w:r>
-    </w:p>
-    <w:p>
-      <w:pPr>
-        <w:spacing w:after="20"/>
-      </w:pPr>
-      <w:r>
-        <w:rPr>
-          <w:rFonts w:ascii="Arial" w:eastAsia="Arial" w:hAnsi="Arial" w:cs="Arial"/>
-          <w:i/>
-          <w:iCs/>
-          <w:color w:val="6B7280"/>
-          <w:sz w:val="17"/>
-          <w:szCs w:val="17"/>
-        </w:rPr>
-        <w:t xml:space="preserve">Laravel · React · TypeScript · </w:t>
-      </w:r>
-      <w:proofErr w:type="spellStart"/>
-      <w:r>
-        <w:rPr>
-          <w:rFonts w:ascii="Arial" w:eastAsia="Arial" w:hAnsi="Arial" w:cs="Arial"/>
-          <w:i/>
-          <w:iCs/>
-          <w:color w:val="6B7280"/>
-          <w:sz w:val="17"/>
-          <w:szCs w:val="17"/>
-        </w:rPr>
-        <w:t>Shadcn</w:t>
-      </w:r>
-      <w:proofErr w:type="spellEnd"/>
-      <w:r>
-        <w:rPr>
-          <w:rFonts w:ascii="Arial" w:eastAsia="Arial" w:hAnsi="Arial" w:cs="Arial"/>
-          <w:i/>
-          <w:iCs/>
-          <w:color w:val="6B7280"/>
-          <w:sz w:val="17"/>
-          <w:szCs w:val="17"/>
-        </w:rPr>
-        <w:t xml:space="preserve"> UI · Docker · Railway</w:t>
+        <w:t>Led a small team that built a solar-energy client's project-management platform with custom file management, e-signatures, and automated compliance workflows, and owned it from planning through deployment and maintenance.</w:t>
       </w:r>
     </w:p>
     <w:p>
@@ -512,16 +439,7 @@
           <w:sz w:val="18"/>
           <w:szCs w:val="18"/>
         </w:rPr>
-        <w:t>Developed a full project management system with custom file management, digital signing, and automated compliance workflows for a solar energy client onboarding investors and installation companies</w:t>
-      </w:r>
-      <w:r>
-        <w:rPr>
-          <w:rFonts w:ascii="Arial" w:eastAsia="Arial" w:hAnsi="Arial" w:cs="Arial"/>
-          <w:color w:val="111827"/>
-          <w:sz w:val="18"/>
-          <w:szCs w:val="18"/>
-        </w:rPr>
-        <w:t>.</w:t>
+        <w:t>Engineered a document-automation system that replaced 100-200+ manual fields with a minimal form, auto-computing and populating 20+ pages of a Word document in a single click.</w:t>
       </w:r>
     </w:p>
     <w:p>
@@ -540,7 +458,7 @@
           <w:sz w:val="18"/>
           <w:szCs w:val="18"/>
         </w:rPr>
-        <w:t>Engineered a document automation system that replaced 100–200+ manual fields with a minimal input form, auto-computing and populating certain fields across 20+ pages in Word document in a single click.</w:t>
+        <w:t>Architected S3-compatible storage (AWS S3 / LocalStack) with a DocuSeal e-signature webhook that auto-ingests each legally signed PDF and audit trail into the bucket on completion.</w:t>
       </w:r>
     </w:p>
     <w:p>
@@ -578,31 +496,7 @@
           <w:sz w:val="19"/>
           <w:szCs w:val="19"/>
         </w:rPr>
-        <w:t xml:space="preserve">PRDP Mindanao Cluster: Public </w:t>
-      </w:r>
-      <w:proofErr w:type="spellStart"/>
-      <w:r>
-        <w:rPr>
-          <w:rFonts w:ascii="Arial" w:eastAsia="Arial" w:hAnsi="Arial" w:cs="Arial"/>
-          <w:b/>
-          <w:bCs/>
-          <w:color w:val="111827"/>
-          <w:sz w:val="19"/>
-          <w:szCs w:val="19"/>
-        </w:rPr>
-        <w:t>Programme</w:t>
-      </w:r>
-      <w:proofErr w:type="spellEnd"/>
-      <w:r>
-        <w:rPr>
-          <w:rFonts w:ascii="Arial" w:eastAsia="Arial" w:hAnsi="Arial" w:cs="Arial"/>
-          <w:b/>
-          <w:bCs/>
-          <w:color w:val="111827"/>
-          <w:sz w:val="19"/>
-          <w:szCs w:val="19"/>
-        </w:rPr>
-        <w:t xml:space="preserve"> Information Site</w:t>
+        <w:t>PRDP Mindanao Cluster: Public Programme Information Site</w:t>
       </w:r>
       <w:r>
         <w:rPr>
@@ -662,7 +556,6 @@
         </w:rPr>
       </w:pPr>
       <w:hyperlink r:id="rId7" w:history="1">
-        <w:proofErr w:type="spellStart"/>
         <w:r>
           <w:rPr>
             <w:rStyle w:val="Hyperlink"/>
@@ -674,7 +567,6 @@
           </w:rPr>
           <w:t>prdpmin.online</w:t>
         </w:r>
-        <w:proofErr w:type="spellEnd"/>
       </w:hyperlink>
     </w:p>
     <w:p>
@@ -690,31 +582,7 @@
           <w:sz w:val="17"/>
           <w:szCs w:val="17"/>
         </w:rPr>
-        <w:t xml:space="preserve">Laravel · React · TypeScript · </w:t>
-      </w:r>
-      <w:proofErr w:type="spellStart"/>
-      <w:r>
-        <w:rPr>
-          <w:rFonts w:ascii="Arial" w:eastAsia="Arial" w:hAnsi="Arial" w:cs="Arial"/>
-          <w:i/>
-          <w:iCs/>
-          <w:color w:val="6B7280"/>
-          <w:sz w:val="17"/>
-          <w:szCs w:val="17"/>
-        </w:rPr>
-        <w:t>Shadcn</w:t>
-      </w:r>
-      <w:proofErr w:type="spellEnd"/>
-      <w:r>
-        <w:rPr>
-          <w:rFonts w:ascii="Arial" w:eastAsia="Arial" w:hAnsi="Arial" w:cs="Arial"/>
-          <w:i/>
-          <w:iCs/>
-          <w:color w:val="6B7280"/>
-          <w:sz w:val="17"/>
-          <w:szCs w:val="17"/>
-        </w:rPr>
-        <w:t xml:space="preserve"> UI · MySQL · Railway</w:t>
+        <w:t>Laravel · React · TypeScript · Shadcn UI · MySQL · Railway</w:t>
       </w:r>
     </w:p>
     <w:p>
@@ -840,41 +708,38 @@
         </w:rPr>
         <w:t xml:space="preserve">TypeScript · </w:t>
       </w:r>
-      <w:proofErr w:type="spellStart"/>
-      <w:r>
-        <w:rPr>
-          <w:rFonts w:ascii="Arial" w:eastAsia="Arial" w:hAnsi="Arial" w:cs="Arial"/>
-          <w:i/>
-          <w:iCs/>
-          <w:color w:val="6B7280"/>
-          <w:sz w:val="17"/>
-          <w:szCs w:val="17"/>
-        </w:rPr>
-        <w:t>Shadcn</w:t>
-      </w:r>
-      <w:proofErr w:type="spellEnd"/>
-      <w:r>
-        <w:rPr>
-          <w:rFonts w:ascii="Arial" w:eastAsia="Arial" w:hAnsi="Arial" w:cs="Arial"/>
-          <w:i/>
-          <w:iCs/>
-          <w:color w:val="6B7280"/>
-          <w:sz w:val="17"/>
-          <w:szCs w:val="17"/>
-        </w:rPr>
-        <w:t xml:space="preserve"> UI · </w:t>
-      </w:r>
-      <w:proofErr w:type="spellStart"/>
-      <w:r>
-        <w:rPr>
-          <w:rFonts w:ascii="Arial" w:eastAsia="Arial" w:hAnsi="Arial" w:cs="Arial"/>
-          <w:i/>
-          <w:iCs/>
-          <w:color w:val="6B7280"/>
-          <w:sz w:val="17"/>
-          <w:szCs w:val="17"/>
-        </w:rPr>
-        <w:t>Docu</w:t>
+      <w:r>
+        <w:rPr>
+          <w:rFonts w:ascii="Arial" w:eastAsia="Arial" w:hAnsi="Arial" w:cs="Arial"/>
+          <w:i/>
+          <w:iCs/>
+          <w:color w:val="6B7280"/>
+          <w:sz w:val="17"/>
+          <w:szCs w:val="17"/>
+        </w:rPr>
+        <w:t>PostgreSQL</w:t>
+      </w:r>
+      <w:r>
+        <w:rPr>
+          <w:rFonts w:ascii="Arial" w:eastAsia="Arial" w:hAnsi="Arial" w:cs="Arial"/>
+          <w:i/>
+          <w:iCs/>
+          <w:color w:val="6B7280"/>
+          <w:sz w:val="17"/>
+          <w:szCs w:val="17"/>
+        </w:rPr>
+        <w:t xml:space="preserve"> · </w:t>
+      </w:r>
+      <w:r>
+        <w:rPr>
+          <w:rFonts w:ascii="Arial" w:eastAsia="Arial" w:hAnsi="Arial" w:cs="Arial"/>
+          <w:i/>
+          <w:iCs/>
+          <w:color w:val="6B7280"/>
+          <w:sz w:val="17"/>
+          <w:szCs w:val="17"/>
+        </w:rPr>
+        <w:t>Shadcn UI · Docu</w:t>
       </w:r>
       <w:r>
         <w:rPr>
@@ -887,7 +752,6 @@
         </w:rPr>
         <w:t>Seal</w:t>
       </w:r>
-      <w:proofErr w:type="spellEnd"/>
       <w:r>
         <w:rPr>
           <w:rFonts w:ascii="Arial" w:eastAsia="Arial" w:hAnsi="Arial" w:cs="Arial"/>
@@ -916,17 +780,7 @@
           <w:sz w:val="18"/>
           <w:szCs w:val="18"/>
         </w:rPr>
-        <w:t xml:space="preserve">Integrated </w:t>
-      </w:r>
-      <w:proofErr w:type="spellStart"/>
-      <w:r>
-        <w:rPr>
-          <w:rFonts w:ascii="Arial" w:eastAsia="Arial" w:hAnsi="Arial" w:cs="Arial"/>
-          <w:color w:val="111827"/>
-          <w:sz w:val="18"/>
-          <w:szCs w:val="18"/>
-        </w:rPr>
-        <w:t>DocuS</w:t>
+        <w:t>Integrated DocuS</w:t>
       </w:r>
       <w:r>
         <w:rPr>
@@ -937,7 +791,6 @@
         </w:rPr>
         <w:t>eal</w:t>
       </w:r>
-      <w:proofErr w:type="spellEnd"/>
       <w:r>
         <w:rPr>
           <w:rFonts w:ascii="Arial" w:eastAsia="Arial" w:hAnsi="Arial" w:cs="Arial"/>
@@ -993,25 +846,23 @@
         </w:numPr>
         <w:spacing w:before="20" w:after="20"/>
       </w:pPr>
-      <w:proofErr w:type="spellStart"/>
-      <w:r>
-        <w:rPr>
-          <w:rFonts w:ascii="Arial" w:eastAsia="Arial" w:hAnsi="Arial" w:cs="Arial"/>
-          <w:color w:val="111827"/>
-          <w:sz w:val="18"/>
-          <w:szCs w:val="18"/>
-        </w:rPr>
-        <w:t>Dockerized</w:t>
-      </w:r>
-      <w:proofErr w:type="spellEnd"/>
-      <w:r>
-        <w:rPr>
-          <w:rFonts w:ascii="Arial" w:eastAsia="Arial" w:hAnsi="Arial" w:cs="Arial"/>
-          <w:color w:val="111827"/>
-          <w:sz w:val="18"/>
-          <w:szCs w:val="18"/>
-        </w:rPr>
-        <w:t xml:space="preserve"> and deployed to Railway; built cloud file management backend using </w:t>
+      <w:r>
+        <w:rPr>
+          <w:rFonts w:ascii="Arial" w:eastAsia="Arial" w:hAnsi="Arial" w:cs="Arial"/>
+          <w:color w:val="111827"/>
+          <w:sz w:val="18"/>
+          <w:szCs w:val="18"/>
+        </w:rPr>
+        <w:t xml:space="preserve">Dockerized and deployed to Railway; built cloud file management backend using </w:t>
+      </w:r>
+      <w:r>
+        <w:rPr>
+          <w:rFonts w:ascii="Arial" w:eastAsia="Arial" w:hAnsi="Arial" w:cs="Arial"/>
+          <w:color w:val="111827"/>
+          <w:sz w:val="18"/>
+          <w:szCs w:val="18"/>
+        </w:rPr>
+        <w:t xml:space="preserve">s3-compatible </w:t>
       </w:r>
       <w:r>
         <w:rPr>
@@ -1039,7 +890,6 @@
         </w:tabs>
         <w:spacing w:before="100" w:after="16"/>
       </w:pPr>
-      <w:proofErr w:type="spellStart"/>
       <w:r>
         <w:rPr>
           <w:rFonts w:ascii="Arial" w:eastAsia="Arial" w:hAnsi="Arial" w:cs="Arial"/>
@@ -1049,19 +899,7 @@
           <w:sz w:val="19"/>
           <w:szCs w:val="19"/>
         </w:rPr>
-        <w:t>LifeLine</w:t>
-      </w:r>
-      <w:proofErr w:type="spellEnd"/>
-      <w:r>
-        <w:rPr>
-          <w:rFonts w:ascii="Arial" w:eastAsia="Arial" w:hAnsi="Arial" w:cs="Arial"/>
-          <w:b/>
-          <w:bCs/>
-          <w:color w:val="111827"/>
-          <w:sz w:val="19"/>
-          <w:szCs w:val="19"/>
-        </w:rPr>
-        <w:t xml:space="preserve"> Connect: Blood Donation Management System</w:t>
+        <w:t>LifeLine Connect: Blood Donation Management System</w:t>
       </w:r>
       <w:r>
         <w:rPr>
@@ -1122,7 +960,6 @@
         </w:rPr>
       </w:pPr>
       <w:hyperlink r:id="rId9" w:history="1">
-        <w:proofErr w:type="spellStart"/>
         <w:r>
           <w:rPr>
             <w:rStyle w:val="Hyperlink"/>
@@ -1134,7 +971,6 @@
           </w:rPr>
           <w:t>lifelineconnect.online</w:t>
         </w:r>
-        <w:proofErr w:type="spellEnd"/>
       </w:hyperlink>
     </w:p>
     <w:p>
@@ -1163,43 +999,94 @@
         </w:rPr>
         <w:t xml:space="preserve">TypeScript · </w:t>
       </w:r>
-      <w:proofErr w:type="spellStart"/>
-      <w:r>
-        <w:rPr>
-          <w:rFonts w:ascii="Arial" w:eastAsia="Arial" w:hAnsi="Arial" w:cs="Arial"/>
-          <w:i/>
-          <w:iCs/>
-          <w:color w:val="6B7280"/>
-          <w:sz w:val="17"/>
-          <w:szCs w:val="17"/>
-        </w:rPr>
-        <w:t>Shadcn</w:t>
-      </w:r>
-      <w:proofErr w:type="spellEnd"/>
-      <w:r>
-        <w:rPr>
-          <w:rFonts w:ascii="Arial" w:eastAsia="Arial" w:hAnsi="Arial" w:cs="Arial"/>
-          <w:i/>
-          <w:iCs/>
-          <w:color w:val="6B7280"/>
-          <w:sz w:val="17"/>
-          <w:szCs w:val="17"/>
-        </w:rPr>
-        <w:t xml:space="preserve"> UI · </w:t>
-      </w:r>
-      <w:proofErr w:type="spellStart"/>
-      <w:r>
-        <w:rPr>
-          <w:rFonts w:ascii="Arial" w:eastAsia="Arial" w:hAnsi="Arial" w:cs="Arial"/>
-          <w:i/>
-          <w:iCs/>
-          <w:color w:val="6B7280"/>
-          <w:sz w:val="17"/>
-          <w:szCs w:val="17"/>
-        </w:rPr>
-        <w:t>WebSockets</w:t>
-      </w:r>
-      <w:proofErr w:type="spellEnd"/>
+      <w:r>
+        <w:rPr>
+          <w:rFonts w:ascii="Arial" w:eastAsia="Arial" w:hAnsi="Arial" w:cs="Arial"/>
+          <w:i/>
+          <w:iCs/>
+          <w:color w:val="6B7280"/>
+          <w:sz w:val="17"/>
+          <w:szCs w:val="17"/>
+        </w:rPr>
+        <w:t>PostgreSQL</w:t>
+      </w:r>
+      <w:r>
+        <w:rPr>
+          <w:rFonts w:ascii="Arial" w:eastAsia="Arial" w:hAnsi="Arial" w:cs="Arial"/>
+          <w:i/>
+          <w:iCs/>
+          <w:color w:val="6B7280"/>
+          <w:sz w:val="17"/>
+          <w:szCs w:val="17"/>
+        </w:rPr>
+        <w:t xml:space="preserve"> · </w:t>
+      </w:r>
+      <w:r>
+        <w:rPr>
+          <w:rFonts w:ascii="Arial" w:eastAsia="Arial" w:hAnsi="Arial" w:cs="Arial"/>
+          <w:i/>
+          <w:iCs/>
+          <w:color w:val="6B7280"/>
+          <w:sz w:val="17"/>
+          <w:szCs w:val="17"/>
+        </w:rPr>
+        <w:t xml:space="preserve">Shadcn UI · </w:t>
+      </w:r>
+      <w:r>
+        <w:rPr>
+          <w:rFonts w:ascii="Arial" w:eastAsia="Arial" w:hAnsi="Arial" w:cs="Arial"/>
+          <w:i/>
+          <w:iCs/>
+          <w:color w:val="6B7280"/>
+          <w:sz w:val="17"/>
+          <w:szCs w:val="17"/>
+        </w:rPr>
+        <w:t>Docker</w:t>
+      </w:r>
+      <w:r>
+        <w:rPr>
+          <w:rFonts w:ascii="Arial" w:eastAsia="Arial" w:hAnsi="Arial" w:cs="Arial"/>
+          <w:i/>
+          <w:iCs/>
+          <w:color w:val="6B7280"/>
+          <w:sz w:val="17"/>
+          <w:szCs w:val="17"/>
+        </w:rPr>
+        <w:t xml:space="preserve"> · </w:t>
+      </w:r>
+      <w:r>
+        <w:rPr>
+          <w:rFonts w:ascii="Arial" w:eastAsia="Arial" w:hAnsi="Arial" w:cs="Arial"/>
+          <w:i/>
+          <w:iCs/>
+          <w:color w:val="6B7280"/>
+          <w:sz w:val="17"/>
+          <w:szCs w:val="17"/>
+        </w:rPr>
+        <w:t>Railway</w:t>
+      </w:r>
+      <w:r>
+        <w:rPr>
+          <w:rFonts w:ascii="Arial" w:eastAsia="Arial" w:hAnsi="Arial" w:cs="Arial"/>
+          <w:i/>
+          <w:iCs/>
+          <w:color w:val="6B7280"/>
+          <w:sz w:val="17"/>
+          <w:szCs w:val="17"/>
+        </w:rPr>
+        <w:t xml:space="preserve"> · </w:t>
+      </w:r>
+      <w:r>
+        <w:rPr>
+          <w:rFonts w:ascii="Arial" w:eastAsia="Arial" w:hAnsi="Arial" w:cs="Arial"/>
+          <w:i/>
+          <w:iCs/>
+          <w:color w:val="6B7280"/>
+          <w:sz w:val="17"/>
+          <w:szCs w:val="17"/>
+        </w:rPr>
+        <w:t>Laravel Reverb</w:t>
+      </w:r>
     </w:p>
     <w:p>
       <w:pPr>
@@ -1217,19 +1104,17 @@
           <w:sz w:val="18"/>
           <w:szCs w:val="18"/>
         </w:rPr>
-        <w:t xml:space="preserve">Implemented real-time blood inventory sync via </w:t>
-      </w:r>
-      <w:proofErr w:type="spellStart"/>
-      <w:r>
-        <w:rPr>
-          <w:rFonts w:ascii="Arial" w:eastAsia="Arial" w:hAnsi="Arial" w:cs="Arial"/>
-          <w:color w:val="111827"/>
-          <w:sz w:val="18"/>
-          <w:szCs w:val="18"/>
-        </w:rPr>
-        <w:t>WebSockets</w:t>
-      </w:r>
-      <w:proofErr w:type="spellEnd"/>
+        <w:t>Implemented real-time blood inventory sync via</w:t>
+      </w:r>
+      <w:r>
+        <w:rPr>
+          <w:rFonts w:ascii="Arial" w:eastAsia="Arial" w:hAnsi="Arial" w:cs="Arial"/>
+          <w:color w:val="111827"/>
+          <w:sz w:val="18"/>
+          <w:szCs w:val="18"/>
+        </w:rPr>
+        <w:t xml:space="preserve"> Laravel Reverb</w:t>
+      </w:r>
       <w:r>
         <w:rPr>
           <w:rFonts w:ascii="Arial" w:eastAsia="Arial" w:hAnsi="Arial" w:cs="Arial"/>
@@ -1562,27 +1447,7 @@
           <w:sz w:val="18"/>
           <w:szCs w:val="18"/>
         </w:rPr>
-        <w:t xml:space="preserve">Laravel, React, Vue, Flutter, Tailwind CSS, </w:t>
-      </w:r>
-      <w:proofErr w:type="spellStart"/>
-      <w:r>
-        <w:rPr>
-          <w:rFonts w:ascii="Arial" w:eastAsia="Arial" w:hAnsi="Arial" w:cs="Arial"/>
-          <w:color w:val="111827"/>
-          <w:sz w:val="18"/>
-          <w:szCs w:val="18"/>
-        </w:rPr>
-        <w:t>Shadcn</w:t>
-      </w:r>
-      <w:proofErr w:type="spellEnd"/>
-      <w:r>
-        <w:rPr>
-          <w:rFonts w:ascii="Arial" w:eastAsia="Arial" w:hAnsi="Arial" w:cs="Arial"/>
-          <w:color w:val="111827"/>
-          <w:sz w:val="18"/>
-          <w:szCs w:val="18"/>
-        </w:rPr>
-        <w:t xml:space="preserve"> UI, Leaflet.js</w:t>
+        <w:t>Laravel, React, Vue, Flutter, Tailwind CSS, Shadcn UI, Leaflet.js</w:t>
       </w:r>
     </w:p>
     <w:p>
@@ -1607,27 +1472,7 @@
           <w:sz w:val="18"/>
           <w:szCs w:val="18"/>
         </w:rPr>
-        <w:t xml:space="preserve">PostgreSQL, MySQL, </w:t>
-      </w:r>
-      <w:proofErr w:type="spellStart"/>
-      <w:r>
-        <w:rPr>
-          <w:rFonts w:ascii="Arial" w:eastAsia="Arial" w:hAnsi="Arial" w:cs="Arial"/>
-          <w:color w:val="111827"/>
-          <w:sz w:val="18"/>
-          <w:szCs w:val="18"/>
-        </w:rPr>
-        <w:t>Supabase</w:t>
-      </w:r>
-      <w:proofErr w:type="spellEnd"/>
-      <w:r>
-        <w:rPr>
-          <w:rFonts w:ascii="Arial" w:eastAsia="Arial" w:hAnsi="Arial" w:cs="Arial"/>
-          <w:color w:val="111827"/>
-          <w:sz w:val="18"/>
-          <w:szCs w:val="18"/>
-        </w:rPr>
-        <w:t>, Firebase</w:t>
+        <w:t>PostgreSQL, MySQL, Supabase, Firebase</w:t>
       </w:r>
     </w:p>
     <w:p>
@@ -1652,41 +1497,27 @@
           <w:sz w:val="18"/>
           <w:szCs w:val="18"/>
         </w:rPr>
-        <w:t xml:space="preserve">Docker, Railway, </w:t>
-      </w:r>
-      <w:proofErr w:type="spellStart"/>
-      <w:r>
-        <w:rPr>
-          <w:rFonts w:ascii="Arial" w:eastAsia="Arial" w:hAnsi="Arial" w:cs="Arial"/>
-          <w:color w:val="111827"/>
-          <w:sz w:val="18"/>
-          <w:szCs w:val="18"/>
-        </w:rPr>
-        <w:t>Vercel</w:t>
-      </w:r>
-      <w:proofErr w:type="spellEnd"/>
-      <w:r>
-        <w:rPr>
-          <w:rFonts w:ascii="Arial" w:eastAsia="Arial" w:hAnsi="Arial" w:cs="Arial"/>
-          <w:color w:val="111827"/>
-          <w:sz w:val="18"/>
-          <w:szCs w:val="18"/>
-        </w:rPr>
-        <w:t>, Git, GitHub</w:t>
-      </w:r>
-      <w:r>
-        <w:rPr>
-          <w:rFonts w:ascii="Arial" w:eastAsia="Arial" w:hAnsi="Arial" w:cs="Arial"/>
-          <w:color w:val="111827"/>
-          <w:sz w:val="18"/>
-          <w:szCs w:val="18"/>
-        </w:rPr>
-        <w:t>, AWS (Cloud Foundations, Cloud Security)</w:t>
+        <w:t>Docker, Railway, Vercel, Git, GitHub</w:t>
+      </w:r>
+      <w:r>
+        <w:rPr>
+          <w:rFonts w:ascii="Arial" w:eastAsia="Arial" w:hAnsi="Arial" w:cs="Arial"/>
+          <w:color w:val="111827"/>
+          <w:sz w:val="18"/>
+          <w:szCs w:val="18"/>
+        </w:rPr>
+        <w:t>, AWS</w:t>
       </w:r>
     </w:p>
     <w:p>
       <w:pPr>
         <w:spacing w:before="30" w:after="30"/>
+        <w:rPr>
+          <w:rFonts w:ascii="Arial" w:eastAsia="Arial" w:hAnsi="Arial" w:cs="Arial"/>
+          <w:color w:val="111827"/>
+          <w:sz w:val="18"/>
+          <w:szCs w:val="18"/>
+        </w:rPr>
       </w:pPr>
       <w:r>
         <w:rPr>
@@ -1697,56 +1528,43 @@
           <w:sz w:val="18"/>
           <w:szCs w:val="18"/>
         </w:rPr>
-        <w:t xml:space="preserve">APIs &amp; Integrations:  </w:t>
-      </w:r>
-      <w:r>
-        <w:rPr>
-          <w:rFonts w:ascii="Arial" w:eastAsia="Arial" w:hAnsi="Arial" w:cs="Arial"/>
-          <w:color w:val="111827"/>
-          <w:sz w:val="18"/>
-          <w:szCs w:val="18"/>
-        </w:rPr>
-        <w:t xml:space="preserve">REST API, </w:t>
-      </w:r>
-      <w:proofErr w:type="spellStart"/>
-      <w:r>
-        <w:rPr>
-          <w:rFonts w:ascii="Arial" w:eastAsia="Arial" w:hAnsi="Arial" w:cs="Arial"/>
-          <w:color w:val="111827"/>
-          <w:sz w:val="18"/>
-          <w:szCs w:val="18"/>
-        </w:rPr>
-        <w:t>WebSockets</w:t>
-      </w:r>
-      <w:proofErr w:type="spellEnd"/>
-      <w:r>
-        <w:rPr>
-          <w:rFonts w:ascii="Arial" w:eastAsia="Arial" w:hAnsi="Arial" w:cs="Arial"/>
-          <w:color w:val="111827"/>
-          <w:sz w:val="18"/>
-          <w:szCs w:val="18"/>
-        </w:rPr>
-        <w:t xml:space="preserve">, </w:t>
-      </w:r>
-      <w:proofErr w:type="spellStart"/>
-      <w:r>
-        <w:rPr>
-          <w:rFonts w:ascii="Arial" w:eastAsia="Arial" w:hAnsi="Arial" w:cs="Arial"/>
-          <w:color w:val="111827"/>
-          <w:sz w:val="18"/>
-          <w:szCs w:val="18"/>
-        </w:rPr>
-        <w:t>DocuSeal</w:t>
-      </w:r>
-      <w:proofErr w:type="spellEnd"/>
-      <w:r>
-        <w:rPr>
-          <w:rFonts w:ascii="Arial" w:eastAsia="Arial" w:hAnsi="Arial" w:cs="Arial"/>
-          <w:color w:val="111827"/>
-          <w:sz w:val="18"/>
-          <w:szCs w:val="18"/>
-        </w:rPr>
-        <w:t xml:space="preserve"> API</w:t>
+        <w:t xml:space="preserve">AI Tools:  </w:t>
+      </w:r>
+      <w:r>
+        <w:rPr>
+          <w:rFonts w:ascii="Arial" w:eastAsia="Arial" w:hAnsi="Arial" w:cs="Arial"/>
+          <w:color w:val="111827"/>
+          <w:sz w:val="18"/>
+          <w:szCs w:val="18"/>
+        </w:rPr>
+        <w:t xml:space="preserve">Claude Code, </w:t>
+      </w:r>
+      <w:r>
+        <w:rPr>
+          <w:rFonts w:ascii="Arial" w:eastAsia="Arial" w:hAnsi="Arial" w:cs="Arial"/>
+          <w:color w:val="111827"/>
+          <w:sz w:val="18"/>
+          <w:szCs w:val="18"/>
+        </w:rPr>
+        <w:t xml:space="preserve">Claude Design, </w:t>
+      </w:r>
+      <w:r>
+        <w:rPr>
+          <w:rFonts w:ascii="Arial" w:eastAsia="Arial" w:hAnsi="Arial" w:cs="Arial"/>
+          <w:color w:val="111827"/>
+          <w:sz w:val="18"/>
+          <w:szCs w:val="18"/>
+        </w:rPr>
+        <w:t xml:space="preserve">ChatGPT, </w:t>
+      </w:r>
+      <w:r>
+        <w:rPr>
+          <w:rFonts w:ascii="Arial" w:eastAsia="Arial" w:hAnsi="Arial" w:cs="Arial"/>
+          <w:color w:val="111827"/>
+          <w:sz w:val="18"/>
+          <w:szCs w:val="18"/>
+        </w:rPr>
+        <w:t>Gemini</w:t>
       </w:r>
     </w:p>
     <w:p>
@@ -1772,6 +1590,33 @@
           <w:szCs w:val="18"/>
         </w:rPr>
         <w:t>Agile/Scrum, Role-Based Access Control, Document Automation</w:t>
+      </w:r>
+      <w:r>
+        <w:rPr>
+          <w:rFonts w:ascii="Arial" w:eastAsia="Arial" w:hAnsi="Arial" w:cs="Arial"/>
+          <w:color w:val="111827"/>
+          <w:sz w:val="18"/>
+          <w:szCs w:val="18"/>
+        </w:rPr>
+        <w:t>, REST API</w:t>
+      </w:r>
+      <w:r>
+        <w:rPr>
+          <w:rFonts w:ascii="Arial" w:eastAsia="Arial" w:hAnsi="Arial" w:cs="Arial"/>
+          <w:color w:val="111827"/>
+          <w:sz w:val="18"/>
+          <w:szCs w:val="18"/>
+        </w:rPr>
+        <w:t>, MVC</w:t>
+      </w:r>
+      <w:r>
+        <w:rPr>
+          <w:rFonts w:ascii="Arial" w:eastAsia="Arial" w:hAnsi="Arial" w:cs="Arial"/>
+          <w:color w:val="111827"/>
+          <w:sz w:val="18"/>
+          <w:szCs w:val="18"/>
+        </w:rPr>
+        <w:t xml:space="preserve"> Architecture</w:t>
       </w:r>
     </w:p>
     <w:sectPr>

</xml_diff>

<commit_message>
removed enterprise in overall summary
</commit_message>
<xml_diff>
--- a/public/resume.docx
+++ b/public/resume.docx
@@ -111,7 +111,25 @@
           <w:sz w:val="18"/>
           <w:szCs w:val="18"/>
         </w:rPr>
-        <w:t>Full Stack Developer with hands-on experience delivering production web applications for clients in government, enterprise, and startup sectors. Proficient in Laravel, React, TypeScript, and cloud infrastructure (Docker, Railway, AWS). Automates complex business processes and integrates third-party APIs, and has delivered complete applications independently, end to end, in compliance-driven environments.</w:t>
+        <w:t>Full Stack Developer with hands-on experience delivering production web applications for clients in government</w:t>
+      </w:r>
+      <w:r>
+        <w:rPr>
+          <w:rFonts w:ascii="Arial" w:eastAsia="Arial" w:hAnsi="Arial" w:cs="Arial"/>
+          <w:color w:val="111827"/>
+          <w:sz w:val="18"/>
+          <w:szCs w:val="18"/>
+        </w:rPr>
+        <w:t xml:space="preserve"> </w:t>
+      </w:r>
+      <w:r>
+        <w:rPr>
+          <w:rFonts w:ascii="Arial" w:eastAsia="Arial" w:hAnsi="Arial" w:cs="Arial"/>
+          <w:color w:val="111827"/>
+          <w:sz w:val="18"/>
+          <w:szCs w:val="18"/>
+        </w:rPr>
+        <w:t>and startup sectors. Proficient in Laravel, React, TypeScript, and cloud infrastructure (Docker, Railway, AWS). Automates complex business processes and integrates third-party APIs, and has delivered complete applications independently, end to end, in compliance-driven environments.</w:t>
       </w:r>
     </w:p>
     <w:p>
@@ -717,18 +735,7 @@
           <w:sz w:val="17"/>
           <w:szCs w:val="17"/>
         </w:rPr>
-        <w:t>PostgreSQL</w:t>
-      </w:r>
-      <w:r>
-        <w:rPr>
-          <w:rFonts w:ascii="Arial" w:eastAsia="Arial" w:hAnsi="Arial" w:cs="Arial"/>
-          <w:i/>
-          <w:iCs/>
-          <w:color w:val="6B7280"/>
-          <w:sz w:val="17"/>
-          <w:szCs w:val="17"/>
-        </w:rPr>
-        <w:t xml:space="preserve"> · </w:t>
+        <w:t xml:space="preserve">PostgreSQL · </w:t>
       </w:r>
       <w:r>
         <w:rPr>
@@ -1008,18 +1015,7 @@
           <w:sz w:val="17"/>
           <w:szCs w:val="17"/>
         </w:rPr>
-        <w:t>PostgreSQL</w:t>
-      </w:r>
-      <w:r>
-        <w:rPr>
-          <w:rFonts w:ascii="Arial" w:eastAsia="Arial" w:hAnsi="Arial" w:cs="Arial"/>
-          <w:i/>
-          <w:iCs/>
-          <w:color w:val="6B7280"/>
-          <w:sz w:val="17"/>
-          <w:szCs w:val="17"/>
-        </w:rPr>
-        <w:t xml:space="preserve"> · </w:t>
+        <w:t xml:space="preserve">PostgreSQL · </w:t>
       </w:r>
       <w:r>
         <w:rPr>
@@ -1041,51 +1037,7 @@
           <w:sz w:val="17"/>
           <w:szCs w:val="17"/>
         </w:rPr>
-        <w:t>Docker</w:t>
-      </w:r>
-      <w:r>
-        <w:rPr>
-          <w:rFonts w:ascii="Arial" w:eastAsia="Arial" w:hAnsi="Arial" w:cs="Arial"/>
-          <w:i/>
-          <w:iCs/>
-          <w:color w:val="6B7280"/>
-          <w:sz w:val="17"/>
-          <w:szCs w:val="17"/>
-        </w:rPr>
-        <w:t xml:space="preserve"> · </w:t>
-      </w:r>
-      <w:r>
-        <w:rPr>
-          <w:rFonts w:ascii="Arial" w:eastAsia="Arial" w:hAnsi="Arial" w:cs="Arial"/>
-          <w:i/>
-          <w:iCs/>
-          <w:color w:val="6B7280"/>
-          <w:sz w:val="17"/>
-          <w:szCs w:val="17"/>
-        </w:rPr>
-        <w:t>Railway</w:t>
-      </w:r>
-      <w:r>
-        <w:rPr>
-          <w:rFonts w:ascii="Arial" w:eastAsia="Arial" w:hAnsi="Arial" w:cs="Arial"/>
-          <w:i/>
-          <w:iCs/>
-          <w:color w:val="6B7280"/>
-          <w:sz w:val="17"/>
-          <w:szCs w:val="17"/>
-        </w:rPr>
-        <w:t xml:space="preserve"> · </w:t>
-      </w:r>
-      <w:r>
-        <w:rPr>
-          <w:rFonts w:ascii="Arial" w:eastAsia="Arial" w:hAnsi="Arial" w:cs="Arial"/>
-          <w:i/>
-          <w:iCs/>
-          <w:color w:val="6B7280"/>
-          <w:sz w:val="17"/>
-          <w:szCs w:val="17"/>
-        </w:rPr>
-        <w:t>Laravel Reverb</w:t>
+        <w:t>Docker · Railway · Laravel Reverb</w:t>
       </w:r>
     </w:p>
     <w:p>

</xml_diff>